<commit_message>
Fix: Update GitHub URL to lokant712, regenerate final reports with correct link
</commit_message>
<xml_diff>
--- a/reports/report.docx
+++ b/reports/report.docx
@@ -231,7 +231,7 @@
                 <w:sz w:val="21"/>
                 <w:u w:val="single"/>
               </w:rPr>
-              <w:t>https://github.com/LokanthS/House-Price-Prediction</w:t>
+              <w:t>https://github.com/lokant712/House-Price-Prediction</w:t>
             </w:r>
           </w:p>
         </w:tc>
@@ -735,7 +735,7 @@
           <w:color w:val="000000"/>
           <w:sz w:val="22"/>
         </w:rPr>
-        <w:t>URL: https://github.com/LokanthS/House-Price-Prediction</w:t>
+        <w:t>URL: https://github.com/lokant712/House-Price-Prediction</w:t>
       </w:r>
     </w:p>
     <w:p>

</xml_diff>